<commit_message>
V1.19.17 atualização nos valores e sistema de download da pc
</commit_message>
<xml_diff>
--- a/codigo/word_templates/proposta_comercial_template.docx
+++ b/codigo/word_templates/proposta_comercial_template.docx
@@ -6,6 +6,7 @@
       <w:pPr>
         <w:pStyle w:val="Heading7"/>
         <w:ind w:firstLine="0"/>
+        <w:jc w:val="right"/>
         <w:rPr>
           <w:rFonts w:ascii="Arial" w:hAnsi="Arial" w:cs="Arial"/>
         </w:rPr>
@@ -16,86 +17,42 @@
       <w:r>
         <w:rPr>
           <w:rFonts w:ascii="Arial" w:hAnsi="Arial" w:cs="Arial"/>
-          <w:b/>
-          <w:bCs/>
         </w:rPr>
-        <w:tab/>
-      </w:r>
-      <w:r>
-        <w:rPr>
-          <w:rFonts w:ascii="Arial" w:hAnsi="Arial" w:cs="Arial"/>
-          <w:b/>
-          <w:bCs/>
-        </w:rPr>
-        <w:tab/>
-      </w:r>
-      <w:r>
-        <w:rPr>
-          <w:rFonts w:ascii="Arial" w:hAnsi="Arial" w:cs="Arial"/>
-          <w:b/>
-          <w:bCs/>
-        </w:rPr>
-        <w:tab/>
-      </w:r>
-      <w:r>
-        <w:rPr>
-          <w:rFonts w:ascii="Arial" w:hAnsi="Arial" w:cs="Arial"/>
-          <w:b/>
-          <w:bCs/>
-        </w:rPr>
-        <w:tab/>
-      </w:r>
-      <w:r>
-        <w:rPr>
-          <w:rFonts w:ascii="Arial" w:hAnsi="Arial" w:cs="Arial"/>
-          <w:b/>
-          <w:bCs/>
-        </w:rPr>
-        <w:tab/>
-      </w:r>
-      <w:r>
-        <w:rPr>
-          <w:rFonts w:ascii="Arial" w:hAnsi="Arial" w:cs="Arial"/>
-          <w:b/>
-          <w:bCs/>
-        </w:rPr>
-        <w:tab/>
-      </w:r>
-      <w:r>
-        <w:rPr>
-          <w:rFonts w:ascii="Arial" w:hAnsi="Arial" w:cs="Arial"/>
-          <w:b/>
-          <w:bCs/>
-        </w:rPr>
-        <w:tab/>
-      </w:r>
-      <w:r>
-        <w:rPr>
-          <w:rFonts w:ascii="Arial" w:hAnsi="Arial" w:cs="Arial"/>
-          <w:b/>
-          <w:bCs/>
-        </w:rPr>
-        <w:tab/>
-      </w:r>
-      <w:r>
-        <w:rPr>
-          <w:rFonts w:ascii="Arial" w:hAnsi="Arial" w:cs="Arial"/>
-          <w:b/>
-          <w:bCs/>
-        </w:rPr>
-        <w:tab/>
-      </w:r>
+        <w:t xml:space="preserve">Belo </w:t>
+      </w:r>
+      <w:proofErr w:type="gramStart"/>
       <w:r>
         <w:rPr>
           <w:rFonts w:ascii="Arial" w:hAnsi="Arial" w:cs="Arial"/>
         </w:rPr>
-        <w:t xml:space="preserve">Belo Horizonte, </w:t>
+        <w:t xml:space="preserve">Horizonte, </w:t>
       </w:r>
       <w:r>
         <w:rPr>
           <w:rFonts w:ascii="Arial" w:hAnsi="Arial" w:cs="Arial"/>
         </w:rPr>
-        <w:t xml:space="preserve"> {{data_emissao}}</w:t>
+        <w:t xml:space="preserve"> {</w:t>
+      </w:r>
+      <w:proofErr w:type="gramEnd"/>
+      <w:r>
+        <w:rPr>
+          <w:rFonts w:ascii="Arial" w:hAnsi="Arial" w:cs="Arial"/>
+        </w:rPr>
+        <w:t>{</w:t>
+      </w:r>
+      <w:proofErr w:type="spellStart"/>
+      <w:r>
+        <w:rPr>
+          <w:rFonts w:ascii="Arial" w:hAnsi="Arial" w:cs="Arial"/>
+        </w:rPr>
+        <w:t>data_emissao</w:t>
+      </w:r>
+      <w:proofErr w:type="spellEnd"/>
+      <w:r>
+        <w:rPr>
+          <w:rFonts w:ascii="Arial" w:hAnsi="Arial" w:cs="Arial"/>
+        </w:rPr>
+        <w:t>}}</w:t>
       </w:r>
       <w:r>
         <w:rPr>
@@ -124,7 +81,27 @@
           <w:sz w:val="26"/>
           <w:szCs w:val="26"/>
         </w:rPr>
-        <w:t>{{empresa_nome}}</w:t>
+        <w:t>{{</w:t>
+      </w:r>
+      <w:proofErr w:type="spellStart"/>
+      <w:r>
+        <w:rPr>
+          <w:b/>
+          <w:bCs/>
+          <w:sz w:val="26"/>
+          <w:szCs w:val="26"/>
+        </w:rPr>
+        <w:t>empresa_nome</w:t>
+      </w:r>
+      <w:proofErr w:type="spellEnd"/>
+      <w:r>
+        <w:rPr>
+          <w:b/>
+          <w:bCs/>
+          <w:sz w:val="26"/>
+          <w:szCs w:val="26"/>
+        </w:rPr>
+        <w:t>}}</w:t>
       </w:r>
     </w:p>
     <w:p>
@@ -262,7 +239,7 @@
           <w:noProof/>
         </w:rPr>
         <w:drawing>
-          <wp:anchor distT="0" distB="0" distL="114300" distR="114300" simplePos="0" relativeHeight="251659264" behindDoc="1" locked="0" layoutInCell="0" allowOverlap="1" wp14:anchorId="49405B78" wp14:editId="66131B0D">
+          <wp:anchor distT="0" distB="0" distL="114300" distR="114300" simplePos="0" relativeHeight="251659264" behindDoc="1" locked="0" layoutInCell="0" allowOverlap="1" wp14:anchorId="49405B78" wp14:editId="28F9AB85">
             <wp:simplePos x="0" y="0"/>
             <wp:positionH relativeFrom="margin">
               <wp:posOffset>542925</wp:posOffset>
@@ -424,7 +401,25 @@
           <w:b/>
           <w:bCs/>
         </w:rPr>
-        <w:t xml:space="preserve">{{projeto.nome}} </w:t>
+        <w:t>{{</w:t>
+      </w:r>
+      <w:proofErr w:type="spellStart"/>
+      <w:proofErr w:type="gramStart"/>
+      <w:r>
+        <w:rPr>
+          <w:b/>
+          <w:bCs/>
+        </w:rPr>
+        <w:t>projeto.nome</w:t>
+      </w:r>
+      <w:proofErr w:type="spellEnd"/>
+      <w:proofErr w:type="gramEnd"/>
+      <w:r>
+        <w:rPr>
+          <w:b/>
+          <w:bCs/>
+        </w:rPr>
+        <w:t xml:space="preserve">}} </w:t>
       </w:r>
     </w:p>
     <w:sdt>
@@ -482,7 +477,53 @@
                           <w:bCs/>
                           <w:lang w:val="en-US"/>
                         </w:rPr>
-                        <w:t>{% for aplicacao in projeto.aplicacoes_groups %}</w:t>
+                        <w:t xml:space="preserve">{% for </w:t>
+                      </w:r>
+                      <w:proofErr w:type="spellStart"/>
+                      <w:r>
+                        <w:rPr>
+                          <w:b/>
+                          <w:bCs/>
+                          <w:lang w:val="en-US"/>
+                        </w:rPr>
+                        <w:t>aplicacao</w:t>
+                      </w:r>
+                      <w:proofErr w:type="spellEnd"/>
+                      <w:r>
+                        <w:rPr>
+                          <w:b/>
+                          <w:bCs/>
+                          <w:lang w:val="en-US"/>
+                        </w:rPr>
+                        <w:t xml:space="preserve"> in </w:t>
+                      </w:r>
+                      <w:proofErr w:type="spellStart"/>
+                      <w:proofErr w:type="gramStart"/>
+                      <w:r>
+                        <w:rPr>
+                          <w:b/>
+                          <w:bCs/>
+                          <w:lang w:val="en-US"/>
+                        </w:rPr>
+                        <w:t>projeto.aplicacoes</w:t>
+                      </w:r>
+                      <w:proofErr w:type="gramEnd"/>
+                      <w:r>
+                        <w:rPr>
+                          <w:b/>
+                          <w:bCs/>
+                          <w:lang w:val="en-US"/>
+                        </w:rPr>
+                        <w:t>_groups</w:t>
+                      </w:r>
+                      <w:proofErr w:type="spellEnd"/>
+                      <w:r>
+                        <w:rPr>
+                          <w:b/>
+                          <w:bCs/>
+                          <w:lang w:val="en-US"/>
+                        </w:rPr>
+                        <w:t xml:space="preserve"> %}</w:t>
                       </w:r>
                     </w:p>
                     <w:p>
@@ -507,12 +548,53 @@
                         </w:rPr>
                         <w:t xml:space="preserve">  </w:t>
                       </w:r>
-                      <w:r>
-                        <w:rPr>
-                          <w:b/>
-                          <w:bCs/>
-                        </w:rPr>
-                        <w:t>{{ aplicacao.nome }}</w:t>
+                      <w:proofErr w:type="gramStart"/>
+                      <w:r>
+                        <w:rPr>
+                          <w:b/>
+                          <w:bCs/>
+                        </w:rPr>
+                        <w:t xml:space="preserve">{{ </w:t>
+                      </w:r>
+                      <w:proofErr w:type="spellStart"/>
+                      <w:r>
+                        <w:rPr>
+                          <w:b/>
+                          <w:bCs/>
+                        </w:rPr>
+                        <w:t>aplicacao</w:t>
+                      </w:r>
+                      <w:proofErr w:type="gramEnd"/>
+                      <w:r>
+                        <w:rPr>
+                          <w:b/>
+                          <w:bCs/>
+                        </w:rPr>
+                        <w:t>.</w:t>
+                      </w:r>
+                      <w:proofErr w:type="gramStart"/>
+                      <w:r>
+                        <w:rPr>
+                          <w:b/>
+                          <w:bCs/>
+                        </w:rPr>
+                        <w:t>nome</w:t>
+                      </w:r>
+                      <w:proofErr w:type="spellEnd"/>
+                      <w:r>
+                        <w:rPr>
+                          <w:b/>
+                          <w:bCs/>
+                        </w:rPr>
+                        <w:t xml:space="preserve"> }</w:t>
+                      </w:r>
+                      <w:proofErr w:type="gramEnd"/>
+                      <w:r>
+                        <w:rPr>
+                          <w:b/>
+                          <w:bCs/>
+                        </w:rPr>
+                        <w:t>}</w:t>
                       </w:r>
                     </w:p>
                     <w:p>
@@ -558,12 +640,46 @@
                         </w:rPr>
                         <w:t>-</w:t>
                       </w:r>
-                      <w:r>
-                        <w:rPr>
-                          <w:b/>
-                          <w:bCs/>
-                        </w:rPr>
-                        <w:t xml:space="preserve">if aplicacao.tem_maquinas </w:t>
+                      <w:proofErr w:type="spellStart"/>
+                      <w:r>
+                        <w:rPr>
+                          <w:b/>
+                          <w:bCs/>
+                        </w:rPr>
+                        <w:t>if</w:t>
+                      </w:r>
+                      <w:proofErr w:type="spellEnd"/>
+                      <w:r>
+                        <w:rPr>
+                          <w:b/>
+                          <w:bCs/>
+                        </w:rPr>
+                        <w:t xml:space="preserve"> </w:t>
+                      </w:r>
+                      <w:proofErr w:type="spellStart"/>
+                      <w:r>
+                        <w:rPr>
+                          <w:b/>
+                          <w:bCs/>
+                        </w:rPr>
+                        <w:t>aplicacao.tem_</w:t>
+                      </w:r>
+                      <w:proofErr w:type="gramStart"/>
+                      <w:r>
+                        <w:rPr>
+                          <w:b/>
+                          <w:bCs/>
+                        </w:rPr>
+                        <w:t>maquinas</w:t>
+                      </w:r>
+                      <w:proofErr w:type="spellEnd"/>
+                      <w:proofErr w:type="gramEnd"/>
+                      <w:r>
+                        <w:rPr>
+                          <w:b/>
+                          <w:bCs/>
+                        </w:rPr>
+                        <w:t xml:space="preserve"> </w:t>
                       </w:r>
                       <w:r>
                         <w:rPr>
@@ -673,12 +789,69 @@
                         </w:rPr>
                         <w:t xml:space="preserve"> </w:t>
                       </w:r>
-                      <w:r>
-                        <w:rPr>
-                          <w:b/>
-                          <w:bCs/>
-                        </w:rPr>
-                        <w:t>{{ aplicacao.total_maquinas_formatado }}</w:t>
+                      <w:proofErr w:type="gramStart"/>
+                      <w:r>
+                        <w:rPr>
+                          <w:b/>
+                          <w:bCs/>
+                        </w:rPr>
+                        <w:t xml:space="preserve">{{ </w:t>
+                      </w:r>
+                      <w:proofErr w:type="spellStart"/>
+                      <w:r>
+                        <w:rPr>
+                          <w:b/>
+                          <w:bCs/>
+                        </w:rPr>
+                        <w:t>aplicacao</w:t>
+                      </w:r>
+                      <w:proofErr w:type="gramEnd"/>
+                      <w:r>
+                        <w:rPr>
+                          <w:b/>
+                          <w:bCs/>
+                        </w:rPr>
+                        <w:t>.total_</w:t>
+                      </w:r>
+                      <w:proofErr w:type="gramStart"/>
+                      <w:r>
+                        <w:rPr>
+                          <w:b/>
+                          <w:bCs/>
+                        </w:rPr>
+                        <w:t>maquinas</w:t>
+                      </w:r>
+                      <w:proofErr w:type="gramEnd"/>
+                      <w:r>
+                        <w:rPr>
+                          <w:b/>
+                          <w:bCs/>
+                        </w:rPr>
+                        <w:t>_</w:t>
+                      </w:r>
+                      <w:proofErr w:type="gramStart"/>
+                      <w:r>
+                        <w:rPr>
+                          <w:b/>
+                          <w:bCs/>
+                        </w:rPr>
+                        <w:t>formatado</w:t>
+                      </w:r>
+                      <w:proofErr w:type="spellEnd"/>
+                      <w:r>
+                        <w:rPr>
+                          <w:b/>
+                          <w:bCs/>
+                        </w:rPr>
+                        <w:t xml:space="preserve"> }</w:t>
+                      </w:r>
+                      <w:proofErr w:type="gramEnd"/>
+                      <w:r>
+                        <w:rPr>
+                          <w:b/>
+                          <w:bCs/>
+                        </w:rPr>
+                        <w:t>}</w:t>
                       </w:r>
                     </w:p>
                     <w:p>
@@ -700,7 +873,32 @@
                           <w:b/>
                           <w:bCs/>
                         </w:rPr>
-                        <w:t>{%- for grupo in aplicacao.maquinas_organizadas %}</w:t>
+                        <w:t xml:space="preserve">{%- for grupo in </w:t>
+                      </w:r>
+                      <w:proofErr w:type="spellStart"/>
+                      <w:proofErr w:type="gramStart"/>
+                      <w:r>
+                        <w:rPr>
+                          <w:b/>
+                          <w:bCs/>
+                        </w:rPr>
+                        <w:t>aplicacao.maquinas</w:t>
+                      </w:r>
+                      <w:proofErr w:type="gramEnd"/>
+                      <w:r>
+                        <w:rPr>
+                          <w:b/>
+                          <w:bCs/>
+                        </w:rPr>
+                        <w:t>_organizadas</w:t>
+                      </w:r>
+                      <w:proofErr w:type="spellEnd"/>
+                      <w:r>
+                        <w:rPr>
+                          <w:b/>
+                          <w:bCs/>
+                        </w:rPr>
+                        <w:t xml:space="preserve"> %}</w:t>
                       </w:r>
                     </w:p>
                     <w:p>
@@ -736,7 +934,41 @@
                           <w:b/>
                           <w:bCs/>
                         </w:rPr>
-                        <w:t xml:space="preserve"> for maquina in grupo.maquinas %}</w:t>
+                        <w:t xml:space="preserve"> for </w:t>
+                      </w:r>
+                      <w:proofErr w:type="gramStart"/>
+                      <w:r>
+                        <w:rPr>
+                          <w:b/>
+                          <w:bCs/>
+                        </w:rPr>
+                        <w:t>maquina</w:t>
+                      </w:r>
+                      <w:proofErr w:type="gramEnd"/>
+                      <w:r>
+                        <w:rPr>
+                          <w:b/>
+                          <w:bCs/>
+                        </w:rPr>
+                        <w:t xml:space="preserve"> in </w:t>
+                      </w:r>
+                      <w:proofErr w:type="spellStart"/>
+                      <w:proofErr w:type="gramStart"/>
+                      <w:r>
+                        <w:rPr>
+                          <w:b/>
+                          <w:bCs/>
+                        </w:rPr>
+                        <w:t>grupo.maquinas</w:t>
+                      </w:r>
+                      <w:proofErr w:type="spellEnd"/>
+                      <w:proofErr w:type="gramEnd"/>
+                      <w:r>
+                        <w:rPr>
+                          <w:b/>
+                          <w:bCs/>
+                        </w:rPr>
+                        <w:t xml:space="preserve"> %}</w:t>
                       </w:r>
                     </w:p>
                     <w:p>
@@ -759,7 +991,103 @@
                         <w:t xml:space="preserve">  </w:t>
                       </w:r>
                       <w:r>
-                        <w:t>Referentes a {{ maquina.quantidade }} equipamento(s) {{ maquina.tipo }} de {{ maquina.potencia }} da {{ maquina.ambiente }}</w:t>
+                        <w:t xml:space="preserve">Referentes a </w:t>
+                      </w:r>
+                      <w:proofErr w:type="gramStart"/>
+                      <w:r>
+                        <w:t xml:space="preserve">{{ </w:t>
+                      </w:r>
+                      <w:proofErr w:type="spellStart"/>
+                      <w:r>
+                        <w:t>maquina</w:t>
+                      </w:r>
+                      <w:proofErr w:type="gramEnd"/>
+                      <w:r>
+                        <w:t>.</w:t>
+                      </w:r>
+                      <w:proofErr w:type="gramStart"/>
+                      <w:r>
+                        <w:t>quantidade</w:t>
+                      </w:r>
+                      <w:proofErr w:type="spellEnd"/>
+                      <w:r>
+                        <w:t xml:space="preserve"> }</w:t>
+                      </w:r>
+                      <w:proofErr w:type="gramEnd"/>
+                      <w:r>
+                        <w:t xml:space="preserve">} equipamento(s) </w:t>
+                      </w:r>
+                      <w:proofErr w:type="gramStart"/>
+                      <w:r>
+                        <w:t xml:space="preserve">{{ </w:t>
+                      </w:r>
+                      <w:proofErr w:type="spellStart"/>
+                      <w:r>
+                        <w:t>maquina</w:t>
+                      </w:r>
+                      <w:proofErr w:type="gramEnd"/>
+                      <w:r>
+                        <w:t>.</w:t>
+                      </w:r>
+                      <w:proofErr w:type="gramStart"/>
+                      <w:r>
+                        <w:t>tipo</w:t>
+                      </w:r>
+                      <w:proofErr w:type="spellEnd"/>
+                      <w:r>
+                        <w:t xml:space="preserve"> }</w:t>
+                      </w:r>
+                      <w:proofErr w:type="gramEnd"/>
+                      <w:r>
+                        <w:t xml:space="preserve">} de </w:t>
+                      </w:r>
+                      <w:proofErr w:type="gramStart"/>
+                      <w:r>
+                        <w:t xml:space="preserve">{{ </w:t>
+                      </w:r>
+                      <w:proofErr w:type="spellStart"/>
+                      <w:r>
+                        <w:t>maquina</w:t>
+                      </w:r>
+                      <w:proofErr w:type="gramEnd"/>
+                      <w:r>
+                        <w:t>.</w:t>
+                      </w:r>
+                      <w:proofErr w:type="gramStart"/>
+                      <w:r>
+                        <w:t>potencia</w:t>
+                      </w:r>
+                      <w:proofErr w:type="spellEnd"/>
+                      <w:r>
+                        <w:t xml:space="preserve"> }</w:t>
+                      </w:r>
+                      <w:proofErr w:type="gramEnd"/>
+                      <w:r>
+                        <w:t xml:space="preserve">} da </w:t>
+                      </w:r>
+                      <w:proofErr w:type="gramStart"/>
+                      <w:r>
+                        <w:t xml:space="preserve">{{ </w:t>
+                      </w:r>
+                      <w:proofErr w:type="spellStart"/>
+                      <w:r>
+                        <w:t>maquina</w:t>
+                      </w:r>
+                      <w:proofErr w:type="gramEnd"/>
+                      <w:r>
+                        <w:t>.</w:t>
+                      </w:r>
+                      <w:proofErr w:type="gramStart"/>
+                      <w:r>
+                        <w:t>ambiente</w:t>
+                      </w:r>
+                      <w:proofErr w:type="spellEnd"/>
+                      <w:r>
+                        <w:t xml:space="preserve"> }</w:t>
+                      </w:r>
+                      <w:proofErr w:type="gramEnd"/>
+                      <w:r>
+                        <w:t>}</w:t>
                       </w:r>
                     </w:p>
                     <w:p>
@@ -781,7 +1109,23 @@
                           <w:b/>
                           <w:bCs/>
                         </w:rPr>
-                        <w:t>{%- endfor %}</w:t>
+                        <w:t xml:space="preserve">{%- </w:t>
+                      </w:r>
+                      <w:proofErr w:type="spellStart"/>
+                      <w:r>
+                        <w:rPr>
+                          <w:b/>
+                          <w:bCs/>
+                        </w:rPr>
+                        <w:t>endfor</w:t>
+                      </w:r>
+                      <w:proofErr w:type="spellEnd"/>
+                      <w:r>
+                        <w:rPr>
+                          <w:b/>
+                          <w:bCs/>
+                        </w:rPr>
+                        <w:t xml:space="preserve"> %}</w:t>
                       </w:r>
                     </w:p>
                     <w:p>
@@ -807,7 +1151,68 @@
                         <w:t xml:space="preserve"> </w:t>
                       </w:r>
                       <w:r>
-                        <w:t>{% if grupo.tem_impostos %}Faturamento Direto: {{ grupo.impostos.fornecedor }}{% endif %}</w:t>
+                        <w:t xml:space="preserve">{% </w:t>
+                      </w:r>
+                      <w:proofErr w:type="spellStart"/>
+                      <w:r>
+                        <w:t>if</w:t>
+                      </w:r>
+                      <w:proofErr w:type="spellEnd"/>
+                      <w:r>
+                        <w:t xml:space="preserve"> </w:t>
+                      </w:r>
+                      <w:proofErr w:type="spellStart"/>
+                      <w:r>
+                        <w:t>grupo.tem_impostos</w:t>
+                      </w:r>
+                      <w:proofErr w:type="spellEnd"/>
+                      <w:r>
+                        <w:t xml:space="preserve"> </w:t>
+                      </w:r>
+                      <w:proofErr w:type="gramStart"/>
+                      <w:r>
+                        <w:t>%}Faturamento</w:t>
+                      </w:r>
+                      <w:proofErr w:type="gramEnd"/>
+                      <w:r>
+                        <w:t xml:space="preserve"> Direto: </w:t>
+                      </w:r>
+                      <w:proofErr w:type="gramStart"/>
+                      <w:r>
+                        <w:t xml:space="preserve">{{ </w:t>
+                      </w:r>
+                      <w:proofErr w:type="spellStart"/>
+                      <w:r>
+                        <w:t>grupo</w:t>
+                      </w:r>
+                      <w:proofErr w:type="gramEnd"/>
+                      <w:r>
+                        <w:t>.</w:t>
+                      </w:r>
+                      <w:proofErr w:type="gramStart"/>
+                      <w:r>
+                        <w:t>impostos.fornecedor</w:t>
+                      </w:r>
+                      <w:proofErr w:type="spellEnd"/>
+                      <w:proofErr w:type="gramEnd"/>
+                      <w:r>
+                        <w:t xml:space="preserve"> </w:t>
+                      </w:r>
+                      <w:proofErr w:type="gramStart"/>
+                      <w:r>
+                        <w:t>}}{</w:t>
+                      </w:r>
+                      <w:proofErr w:type="gramEnd"/>
+                      <w:r>
+                        <w:t xml:space="preserve">% </w:t>
+                      </w:r>
+                      <w:proofErr w:type="spellStart"/>
+                      <w:r>
+                        <w:t>endif</w:t>
+                      </w:r>
+                      <w:proofErr w:type="spellEnd"/>
+                      <w:r>
+                        <w:t xml:space="preserve"> %}</w:t>
                       </w:r>
                     </w:p>
                     <w:p>
@@ -833,7 +1238,73 @@
                         <w:t xml:space="preserve"> </w:t>
                       </w:r>
                       <w:r>
-                        <w:t>{%if grupo.impostos.frete %}Entrega em: {{ grupo.impostos.frete }}{% endif %}</w:t>
+                        <w:t>{%</w:t>
+                      </w:r>
+                      <w:proofErr w:type="spellStart"/>
+                      <w:r>
+                        <w:t>if</w:t>
+                      </w:r>
+                      <w:proofErr w:type="spellEnd"/>
+                      <w:r>
+                        <w:t xml:space="preserve"> </w:t>
+                      </w:r>
+                      <w:proofErr w:type="spellStart"/>
+                      <w:proofErr w:type="gramStart"/>
+                      <w:r>
+                        <w:t>grupo.impostos</w:t>
+                      </w:r>
+                      <w:proofErr w:type="gramEnd"/>
+                      <w:r>
+                        <w:t>.frete</w:t>
+                      </w:r>
+                      <w:proofErr w:type="spellEnd"/>
+                      <w:r>
+                        <w:t xml:space="preserve"> </w:t>
+                      </w:r>
+                      <w:proofErr w:type="gramStart"/>
+                      <w:r>
+                        <w:t>%}Entrega</w:t>
+                      </w:r>
+                      <w:proofErr w:type="gramEnd"/>
+                      <w:r>
+                        <w:t xml:space="preserve"> em: </w:t>
+                      </w:r>
+                      <w:proofErr w:type="gramStart"/>
+                      <w:r>
+                        <w:t xml:space="preserve">{{ </w:t>
+                      </w:r>
+                      <w:proofErr w:type="spellStart"/>
+                      <w:r>
+                        <w:t>grupo</w:t>
+                      </w:r>
+                      <w:proofErr w:type="gramEnd"/>
+                      <w:r>
+                        <w:t>.</w:t>
+                      </w:r>
+                      <w:proofErr w:type="gramStart"/>
+                      <w:r>
+                        <w:t>impostos.frete</w:t>
+                      </w:r>
+                      <w:proofErr w:type="spellEnd"/>
+                      <w:proofErr w:type="gramEnd"/>
+                      <w:r>
+                        <w:t xml:space="preserve"> </w:t>
+                      </w:r>
+                      <w:proofErr w:type="gramStart"/>
+                      <w:r>
+                        <w:t>}}{</w:t>
+                      </w:r>
+                      <w:proofErr w:type="gramEnd"/>
+                      <w:r>
+                        <w:t xml:space="preserve">% </w:t>
+                      </w:r>
+                      <w:proofErr w:type="spellStart"/>
+                      <w:r>
+                        <w:t>endif</w:t>
+                      </w:r>
+                      <w:proofErr w:type="spellEnd"/>
+                      <w:r>
+                        <w:t xml:space="preserve"> %}</w:t>
                       </w:r>
                     </w:p>
                     <w:p>
@@ -856,7 +1327,73 @@
                         <w:t xml:space="preserve"> </w:t>
                       </w:r>
                       <w:r>
-                        <w:t>{% if grupo.impostos.icms %}ICMS: {{ grupo.impostos.icms }}{% endif %}</w:t>
+                        <w:t xml:space="preserve">{% </w:t>
+                      </w:r>
+                      <w:proofErr w:type="spellStart"/>
+                      <w:r>
+                        <w:t>if</w:t>
+                      </w:r>
+                      <w:proofErr w:type="spellEnd"/>
+                      <w:r>
+                        <w:t xml:space="preserve"> </w:t>
+                      </w:r>
+                      <w:proofErr w:type="spellStart"/>
+                      <w:proofErr w:type="gramStart"/>
+                      <w:r>
+                        <w:t>grupo.impostos</w:t>
+                      </w:r>
+                      <w:proofErr w:type="gramEnd"/>
+                      <w:r>
+                        <w:t>.icms</w:t>
+                      </w:r>
+                      <w:proofErr w:type="spellEnd"/>
+                      <w:r>
+                        <w:t xml:space="preserve"> </w:t>
+                      </w:r>
+                      <w:proofErr w:type="gramStart"/>
+                      <w:r>
+                        <w:t>%}ICMS</w:t>
+                      </w:r>
+                      <w:proofErr w:type="gramEnd"/>
+                      <w:r>
+                        <w:t xml:space="preserve">: </w:t>
+                      </w:r>
+                      <w:proofErr w:type="gramStart"/>
+                      <w:r>
+                        <w:t xml:space="preserve">{{ </w:t>
+                      </w:r>
+                      <w:proofErr w:type="spellStart"/>
+                      <w:r>
+                        <w:t>grupo</w:t>
+                      </w:r>
+                      <w:proofErr w:type="gramEnd"/>
+                      <w:r>
+                        <w:t>.</w:t>
+                      </w:r>
+                      <w:proofErr w:type="gramStart"/>
+                      <w:r>
+                        <w:t>impostos.icms</w:t>
+                      </w:r>
+                      <w:proofErr w:type="spellEnd"/>
+                      <w:proofErr w:type="gramEnd"/>
+                      <w:r>
+                        <w:t xml:space="preserve"> </w:t>
+                      </w:r>
+                      <w:proofErr w:type="gramStart"/>
+                      <w:r>
+                        <w:t>}}{</w:t>
+                      </w:r>
+                      <w:proofErr w:type="gramEnd"/>
+                      <w:r>
+                        <w:t xml:space="preserve">% </w:t>
+                      </w:r>
+                      <w:proofErr w:type="spellStart"/>
+                      <w:r>
+                        <w:t>endif</w:t>
+                      </w:r>
+                      <w:proofErr w:type="spellEnd"/>
+                      <w:r>
+                        <w:t xml:space="preserve"> %}</w:t>
                       </w:r>
                     </w:p>
                     <w:p>
@@ -879,7 +1416,60 @@
                         <w:t xml:space="preserve"> </w:t>
                       </w:r>
                       <w:r>
-                        <w:t>{%if grupo.impostos.ipi %}IPI: {{ grupo.impostos.ipi }}{% endif %}</w:t>
+                        <w:t>{%</w:t>
+                      </w:r>
+                      <w:proofErr w:type="spellStart"/>
+                      <w:r>
+                        <w:t>if</w:t>
+                      </w:r>
+                      <w:proofErr w:type="spellEnd"/>
+                      <w:r>
+                        <w:t xml:space="preserve"> </w:t>
+                      </w:r>
+                      <w:proofErr w:type="spellStart"/>
+                      <w:r>
+                        <w:t>grupo.impostos.ipi</w:t>
+                      </w:r>
+                      <w:proofErr w:type="spellEnd"/>
+                      <w:r>
+                        <w:t xml:space="preserve"> </w:t>
+                      </w:r>
+                      <w:proofErr w:type="gramStart"/>
+                      <w:r>
+                        <w:t>%}IPI</w:t>
+                      </w:r>
+                      <w:proofErr w:type="gramEnd"/>
+                      <w:r>
+                        <w:t xml:space="preserve">: </w:t>
+                      </w:r>
+                      <w:proofErr w:type="gramStart"/>
+                      <w:r>
+                        <w:t xml:space="preserve">{{ </w:t>
+                      </w:r>
+                      <w:proofErr w:type="spellStart"/>
+                      <w:r>
+                        <w:t>grupo.impostos.ipi</w:t>
+                      </w:r>
+                      <w:proofErr w:type="spellEnd"/>
+                      <w:proofErr w:type="gramEnd"/>
+                      <w:r>
+                        <w:t xml:space="preserve"> </w:t>
+                      </w:r>
+                      <w:proofErr w:type="gramStart"/>
+                      <w:r>
+                        <w:t>}}{</w:t>
+                      </w:r>
+                      <w:proofErr w:type="gramEnd"/>
+                      <w:r>
+                        <w:t xml:space="preserve">% </w:t>
+                      </w:r>
+                      <w:proofErr w:type="spellStart"/>
+                      <w:r>
+                        <w:t>endif</w:t>
+                      </w:r>
+                      <w:proofErr w:type="spellEnd"/>
+                      <w:r>
+                        <w:t xml:space="preserve"> %}</w:t>
                       </w:r>
                     </w:p>
                     <w:p>
@@ -901,7 +1491,23 @@
                           <w:b/>
                           <w:bCs/>
                         </w:rPr>
-                        <w:t>{% endfor %}</w:t>
+                        <w:t xml:space="preserve">{% </w:t>
+                      </w:r>
+                      <w:proofErr w:type="spellStart"/>
+                      <w:r>
+                        <w:rPr>
+                          <w:b/>
+                          <w:bCs/>
+                        </w:rPr>
+                        <w:t>endfor</w:t>
+                      </w:r>
+                      <w:proofErr w:type="spellEnd"/>
+                      <w:r>
+                        <w:rPr>
+                          <w:b/>
+                          <w:bCs/>
+                        </w:rPr>
+                        <w:t xml:space="preserve"> %}</w:t>
                       </w:r>
                     </w:p>
                     <w:p>
@@ -923,7 +1529,23 @@
                           <w:b/>
                           <w:bCs/>
                         </w:rPr>
-                        <w:t>{%- endif %}</w:t>
+                        <w:t xml:space="preserve">{%- </w:t>
+                      </w:r>
+                      <w:proofErr w:type="spellStart"/>
+                      <w:r>
+                        <w:rPr>
+                          <w:b/>
+                          <w:bCs/>
+                        </w:rPr>
+                        <w:t>endif</w:t>
+                      </w:r>
+                      <w:proofErr w:type="spellEnd"/>
+                      <w:r>
+                        <w:rPr>
+                          <w:b/>
+                          <w:bCs/>
+                        </w:rPr>
+                        <w:t xml:space="preserve"> %}</w:t>
                       </w:r>
                     </w:p>
                     <w:p>
@@ -959,7 +1581,41 @@
                           <w:b/>
                           <w:bCs/>
                         </w:rPr>
-                        <w:t xml:space="preserve"> if aplicacao.dutos </w:t>
+                        <w:t xml:space="preserve"> </w:t>
+                      </w:r>
+                      <w:proofErr w:type="spellStart"/>
+                      <w:r>
+                        <w:rPr>
+                          <w:b/>
+                          <w:bCs/>
+                        </w:rPr>
+                        <w:t>if</w:t>
+                      </w:r>
+                      <w:proofErr w:type="spellEnd"/>
+                      <w:r>
+                        <w:rPr>
+                          <w:b/>
+                          <w:bCs/>
+                        </w:rPr>
+                        <w:t xml:space="preserve"> </w:t>
+                      </w:r>
+                      <w:proofErr w:type="spellStart"/>
+                      <w:proofErr w:type="gramStart"/>
+                      <w:r>
+                        <w:rPr>
+                          <w:b/>
+                          <w:bCs/>
+                        </w:rPr>
+                        <w:t>aplicacao.dutos</w:t>
+                      </w:r>
+                      <w:proofErr w:type="spellEnd"/>
+                      <w:proofErr w:type="gramEnd"/>
+                      <w:r>
+                        <w:rPr>
+                          <w:b/>
+                          <w:bCs/>
+                        </w:rPr>
+                        <w:t xml:space="preserve"> </w:t>
                       </w:r>
                       <w:r>
                         <w:rPr>
@@ -1043,12 +1699,53 @@
                         </w:rPr>
                         <w:t xml:space="preserve">      </w:t>
                       </w:r>
-                      <w:r>
-                        <w:rPr>
-                          <w:b/>
-                          <w:bCs/>
-                        </w:rPr>
-                        <w:t>{{ aplicacao.total_dutos_formatado }}</w:t>
+                      <w:proofErr w:type="gramStart"/>
+                      <w:r>
+                        <w:rPr>
+                          <w:b/>
+                          <w:bCs/>
+                        </w:rPr>
+                        <w:t xml:space="preserve">{{ </w:t>
+                      </w:r>
+                      <w:proofErr w:type="spellStart"/>
+                      <w:r>
+                        <w:rPr>
+                          <w:b/>
+                          <w:bCs/>
+                        </w:rPr>
+                        <w:t>aplicacao</w:t>
+                      </w:r>
+                      <w:proofErr w:type="gramEnd"/>
+                      <w:r>
+                        <w:rPr>
+                          <w:b/>
+                          <w:bCs/>
+                        </w:rPr>
+                        <w:t>.total_dutos_</w:t>
+                      </w:r>
+                      <w:proofErr w:type="gramStart"/>
+                      <w:r>
+                        <w:rPr>
+                          <w:b/>
+                          <w:bCs/>
+                        </w:rPr>
+                        <w:t>formatado</w:t>
+                      </w:r>
+                      <w:proofErr w:type="spellEnd"/>
+                      <w:r>
+                        <w:rPr>
+                          <w:b/>
+                          <w:bCs/>
+                        </w:rPr>
+                        <w:t xml:space="preserve"> }</w:t>
+                      </w:r>
+                      <w:proofErr w:type="gramEnd"/>
+                      <w:r>
+                        <w:rPr>
+                          <w:b/>
+                          <w:bCs/>
+                        </w:rPr>
+                        <w:t>}</w:t>
                       </w:r>
                     </w:p>
                     <w:p>
@@ -1070,7 +1767,25 @@
                           <w:b/>
                           <w:bCs/>
                         </w:rPr>
-                        <w:t>{%- for duto in aplicacao.dutos %}</w:t>
+                        <w:t xml:space="preserve">{%- for duto in </w:t>
+                      </w:r>
+                      <w:proofErr w:type="spellStart"/>
+                      <w:proofErr w:type="gramStart"/>
+                      <w:r>
+                        <w:rPr>
+                          <w:b/>
+                          <w:bCs/>
+                        </w:rPr>
+                        <w:t>aplicacao.dutos</w:t>
+                      </w:r>
+                      <w:proofErr w:type="spellEnd"/>
+                      <w:proofErr w:type="gramEnd"/>
+                      <w:r>
+                        <w:rPr>
+                          <w:b/>
+                          <w:bCs/>
+                        </w:rPr>
+                        <w:t xml:space="preserve"> %}</w:t>
                       </w:r>
                     </w:p>
                     <w:p>
@@ -1093,7 +1808,79 @@
                         <w:t xml:space="preserve">   </w:t>
                       </w:r>
                       <w:r>
-                        <w:t>Referentes a {{ duto.quantidade }} equipamento(s) {{ duto.tipo }} da {{ duto.ambiente }}</w:t>
+                        <w:t xml:space="preserve">Referentes a </w:t>
+                      </w:r>
+                      <w:proofErr w:type="gramStart"/>
+                      <w:r>
+                        <w:t xml:space="preserve">{{ </w:t>
+                      </w:r>
+                      <w:proofErr w:type="spellStart"/>
+                      <w:r>
+                        <w:t>duto</w:t>
+                      </w:r>
+                      <w:proofErr w:type="gramEnd"/>
+                      <w:r>
+                        <w:t>.</w:t>
+                      </w:r>
+                      <w:proofErr w:type="gramStart"/>
+                      <w:r>
+                        <w:t>quantidade</w:t>
+                      </w:r>
+                      <w:proofErr w:type="spellEnd"/>
+                      <w:r>
+                        <w:t xml:space="preserve"> }</w:t>
+                      </w:r>
+                      <w:proofErr w:type="gramEnd"/>
+                      <w:r>
+                        <w:t xml:space="preserve">} equipamento(s) </w:t>
+                      </w:r>
+                      <w:proofErr w:type="gramStart"/>
+                      <w:r>
+                        <w:t xml:space="preserve">{{ </w:t>
+                      </w:r>
+                      <w:proofErr w:type="spellStart"/>
+                      <w:r>
+                        <w:t>duto</w:t>
+                      </w:r>
+                      <w:proofErr w:type="gramEnd"/>
+                      <w:r>
+                        <w:t>.</w:t>
+                      </w:r>
+                      <w:proofErr w:type="gramStart"/>
+                      <w:r>
+                        <w:t>tipo</w:t>
+                      </w:r>
+                      <w:proofErr w:type="spellEnd"/>
+                      <w:r>
+                        <w:t xml:space="preserve"> }</w:t>
+                      </w:r>
+                      <w:proofErr w:type="gramEnd"/>
+                      <w:r>
+                        <w:t xml:space="preserve">} da </w:t>
+                      </w:r>
+                      <w:proofErr w:type="gramStart"/>
+                      <w:r>
+                        <w:t xml:space="preserve">{{ </w:t>
+                      </w:r>
+                      <w:proofErr w:type="spellStart"/>
+                      <w:r>
+                        <w:t>duto</w:t>
+                      </w:r>
+                      <w:proofErr w:type="gramEnd"/>
+                      <w:r>
+                        <w:t>.</w:t>
+                      </w:r>
+                      <w:proofErr w:type="gramStart"/>
+                      <w:r>
+                        <w:t>ambiente</w:t>
+                      </w:r>
+                      <w:proofErr w:type="spellEnd"/>
+                      <w:r>
+                        <w:t xml:space="preserve"> }</w:t>
+                      </w:r>
+                      <w:proofErr w:type="gramEnd"/>
+                      <w:r>
+                        <w:t>}</w:t>
                       </w:r>
                     </w:p>
                     <w:p>
@@ -1129,7 +1916,23 @@
                           <w:b/>
                           <w:bCs/>
                         </w:rPr>
-                        <w:t xml:space="preserve"> endfor %}</w:t>
+                        <w:t xml:space="preserve"> </w:t>
+                      </w:r>
+                      <w:proofErr w:type="spellStart"/>
+                      <w:r>
+                        <w:rPr>
+                          <w:b/>
+                          <w:bCs/>
+                        </w:rPr>
+                        <w:t>endfor</w:t>
+                      </w:r>
+                      <w:proofErr w:type="spellEnd"/>
+                      <w:r>
+                        <w:rPr>
+                          <w:b/>
+                          <w:bCs/>
+                        </w:rPr>
+                        <w:t xml:space="preserve"> %}</w:t>
                       </w:r>
                     </w:p>
                     <w:p>
@@ -1151,7 +1954,23 @@
                           <w:b/>
                           <w:bCs/>
                         </w:rPr>
-                        <w:t>{% endif %}</w:t>
+                        <w:t xml:space="preserve">{% </w:t>
+                      </w:r>
+                      <w:proofErr w:type="spellStart"/>
+                      <w:r>
+                        <w:rPr>
+                          <w:b/>
+                          <w:bCs/>
+                        </w:rPr>
+                        <w:t>endif</w:t>
+                      </w:r>
+                      <w:proofErr w:type="spellEnd"/>
+                      <w:r>
+                        <w:rPr>
+                          <w:b/>
+                          <w:bCs/>
+                        </w:rPr>
+                        <w:t xml:space="preserve"> %}</w:t>
                       </w:r>
                     </w:p>
                     <w:p>
@@ -1187,7 +2006,41 @@
                           <w:b/>
                           <w:bCs/>
                         </w:rPr>
-                        <w:t xml:space="preserve"> if aplicacao.acessorios </w:t>
+                        <w:t xml:space="preserve"> </w:t>
+                      </w:r>
+                      <w:proofErr w:type="spellStart"/>
+                      <w:r>
+                        <w:rPr>
+                          <w:b/>
+                          <w:bCs/>
+                        </w:rPr>
+                        <w:t>if</w:t>
+                      </w:r>
+                      <w:proofErr w:type="spellEnd"/>
+                      <w:r>
+                        <w:rPr>
+                          <w:b/>
+                          <w:bCs/>
+                        </w:rPr>
+                        <w:t xml:space="preserve"> </w:t>
+                      </w:r>
+                      <w:proofErr w:type="spellStart"/>
+                      <w:proofErr w:type="gramStart"/>
+                      <w:r>
+                        <w:rPr>
+                          <w:b/>
+                          <w:bCs/>
+                        </w:rPr>
+                        <w:t>aplicacao.acessorios</w:t>
+                      </w:r>
+                      <w:proofErr w:type="spellEnd"/>
+                      <w:proofErr w:type="gramEnd"/>
+                      <w:r>
+                        <w:rPr>
+                          <w:b/>
+                          <w:bCs/>
+                        </w:rPr>
+                        <w:t xml:space="preserve"> </w:t>
                       </w:r>
                       <w:r>
                         <w:rPr>
@@ -1283,12 +2136,53 @@
                         </w:rPr>
                         <w:t xml:space="preserve">  </w:t>
                       </w:r>
-                      <w:r>
-                        <w:rPr>
-                          <w:b/>
-                          <w:bCs/>
-                        </w:rPr>
-                        <w:t>{{ aplicacao.total_acessorios_formatado }}</w:t>
+                      <w:proofErr w:type="gramStart"/>
+                      <w:r>
+                        <w:rPr>
+                          <w:b/>
+                          <w:bCs/>
+                        </w:rPr>
+                        <w:t xml:space="preserve">{{ </w:t>
+                      </w:r>
+                      <w:proofErr w:type="spellStart"/>
+                      <w:r>
+                        <w:rPr>
+                          <w:b/>
+                          <w:bCs/>
+                        </w:rPr>
+                        <w:t>aplicacao</w:t>
+                      </w:r>
+                      <w:proofErr w:type="gramEnd"/>
+                      <w:r>
+                        <w:rPr>
+                          <w:b/>
+                          <w:bCs/>
+                        </w:rPr>
+                        <w:t>.total_acessorios_</w:t>
+                      </w:r>
+                      <w:proofErr w:type="gramStart"/>
+                      <w:r>
+                        <w:rPr>
+                          <w:b/>
+                          <w:bCs/>
+                        </w:rPr>
+                        <w:t>formatado</w:t>
+                      </w:r>
+                      <w:proofErr w:type="spellEnd"/>
+                      <w:r>
+                        <w:rPr>
+                          <w:b/>
+                          <w:bCs/>
+                        </w:rPr>
+                        <w:t xml:space="preserve"> }</w:t>
+                      </w:r>
+                      <w:proofErr w:type="gramEnd"/>
+                      <w:r>
+                        <w:rPr>
+                          <w:b/>
+                          <w:bCs/>
+                        </w:rPr>
+                        <w:t>}</w:t>
                       </w:r>
                     </w:p>
                     <w:p>
@@ -1310,7 +2204,41 @@
                           <w:b/>
                           <w:bCs/>
                         </w:rPr>
-                        <w:t>{%- for acessorio in aplicacao.acessorios %}</w:t>
+                        <w:t xml:space="preserve">{%- for </w:t>
+                      </w:r>
+                      <w:proofErr w:type="spellStart"/>
+                      <w:r>
+                        <w:rPr>
+                          <w:b/>
+                          <w:bCs/>
+                        </w:rPr>
+                        <w:t>acessorio</w:t>
+                      </w:r>
+                      <w:proofErr w:type="spellEnd"/>
+                      <w:r>
+                        <w:rPr>
+                          <w:b/>
+                          <w:bCs/>
+                        </w:rPr>
+                        <w:t xml:space="preserve"> in </w:t>
+                      </w:r>
+                      <w:proofErr w:type="spellStart"/>
+                      <w:proofErr w:type="gramStart"/>
+                      <w:r>
+                        <w:rPr>
+                          <w:b/>
+                          <w:bCs/>
+                        </w:rPr>
+                        <w:t>aplicacao.acessorios</w:t>
+                      </w:r>
+                      <w:proofErr w:type="spellEnd"/>
+                      <w:proofErr w:type="gramEnd"/>
+                      <w:r>
+                        <w:rPr>
+                          <w:b/>
+                          <w:bCs/>
+                        </w:rPr>
+                        <w:t xml:space="preserve"> %}</w:t>
                       </w:r>
                     </w:p>
                     <w:p>
@@ -1334,7 +2262,118 @@
                         <w:t xml:space="preserve">  </w:t>
                       </w:r>
                       <w:r>
-                        <w:t>Referentes a {{ acessorio.quantidade }} equipamento(s) {{ acessorio.tipo }}{% if acessorio.dimensao %} – {{acessorio.dimensao}}{% endif %} da {{ acessorio.ambiente }}</w:t>
+                        <w:t xml:space="preserve">Referentes a </w:t>
+                      </w:r>
+                      <w:proofErr w:type="gramStart"/>
+                      <w:r>
+                        <w:t xml:space="preserve">{{ </w:t>
+                      </w:r>
+                      <w:proofErr w:type="spellStart"/>
+                      <w:r>
+                        <w:t>acessorio</w:t>
+                      </w:r>
+                      <w:proofErr w:type="gramEnd"/>
+                      <w:r>
+                        <w:t>.</w:t>
+                      </w:r>
+                      <w:proofErr w:type="gramStart"/>
+                      <w:r>
+                        <w:t>quantidade</w:t>
+                      </w:r>
+                      <w:proofErr w:type="spellEnd"/>
+                      <w:r>
+                        <w:t xml:space="preserve"> }</w:t>
+                      </w:r>
+                      <w:proofErr w:type="gramEnd"/>
+                      <w:r>
+                        <w:t xml:space="preserve">} equipamento(s) </w:t>
+                      </w:r>
+                      <w:proofErr w:type="gramStart"/>
+                      <w:r>
+                        <w:t xml:space="preserve">{{ </w:t>
+                      </w:r>
+                      <w:proofErr w:type="spellStart"/>
+                      <w:r>
+                        <w:t>acessorio</w:t>
+                      </w:r>
+                      <w:proofErr w:type="gramEnd"/>
+                      <w:r>
+                        <w:t>.</w:t>
+                      </w:r>
+                      <w:proofErr w:type="gramStart"/>
+                      <w:r>
+                        <w:t>tipo</w:t>
+                      </w:r>
+                      <w:proofErr w:type="spellEnd"/>
+                      <w:r>
+                        <w:t xml:space="preserve"> }}{</w:t>
+                      </w:r>
+                      <w:proofErr w:type="gramEnd"/>
+                      <w:r>
+                        <w:t xml:space="preserve">% </w:t>
+                      </w:r>
+                      <w:proofErr w:type="spellStart"/>
+                      <w:r>
+                        <w:t>if</w:t>
+                      </w:r>
+                      <w:proofErr w:type="spellEnd"/>
+                      <w:r>
+                        <w:t xml:space="preserve"> </w:t>
+                      </w:r>
+                      <w:proofErr w:type="spellStart"/>
+                      <w:proofErr w:type="gramStart"/>
+                      <w:r>
+                        <w:t>acessorio.dimensao</w:t>
+                      </w:r>
+                      <w:proofErr w:type="spellEnd"/>
+                      <w:proofErr w:type="gramEnd"/>
+                      <w:r>
+                        <w:t xml:space="preserve"> %} – {{</w:t>
+                      </w:r>
+                      <w:proofErr w:type="spellStart"/>
+                      <w:proofErr w:type="gramStart"/>
+                      <w:r>
+                        <w:t>acessorio.dimensao</w:t>
+                      </w:r>
+                      <w:proofErr w:type="spellEnd"/>
+                      <w:r>
+                        <w:t>}}{</w:t>
+                      </w:r>
+                      <w:proofErr w:type="gramEnd"/>
+                      <w:r>
+                        <w:t xml:space="preserve">% </w:t>
+                      </w:r>
+                      <w:proofErr w:type="spellStart"/>
+                      <w:r>
+                        <w:t>endif</w:t>
+                      </w:r>
+                      <w:proofErr w:type="spellEnd"/>
+                      <w:r>
+                        <w:t xml:space="preserve"> %} da </w:t>
+                      </w:r>
+                      <w:proofErr w:type="gramStart"/>
+                      <w:r>
+                        <w:t xml:space="preserve">{{ </w:t>
+                      </w:r>
+                      <w:proofErr w:type="spellStart"/>
+                      <w:r>
+                        <w:t>acessorio</w:t>
+                      </w:r>
+                      <w:proofErr w:type="gramEnd"/>
+                      <w:r>
+                        <w:t>.</w:t>
+                      </w:r>
+                      <w:proofErr w:type="gramStart"/>
+                      <w:r>
+                        <w:t>ambiente</w:t>
+                      </w:r>
+                      <w:proofErr w:type="spellEnd"/>
+                      <w:r>
+                        <w:t xml:space="preserve"> }</w:t>
+                      </w:r>
+                      <w:proofErr w:type="gramEnd"/>
+                      <w:r>
+                        <w:t>}</w:t>
                       </w:r>
                     </w:p>
                     <w:p>
@@ -1370,7 +2409,23 @@
                           <w:b/>
                           <w:bCs/>
                         </w:rPr>
-                        <w:t xml:space="preserve"> endfor %}</w:t>
+                        <w:t xml:space="preserve"> </w:t>
+                      </w:r>
+                      <w:proofErr w:type="spellStart"/>
+                      <w:r>
+                        <w:rPr>
+                          <w:b/>
+                          <w:bCs/>
+                        </w:rPr>
+                        <w:t>endfor</w:t>
+                      </w:r>
+                      <w:proofErr w:type="spellEnd"/>
+                      <w:r>
+                        <w:rPr>
+                          <w:b/>
+                          <w:bCs/>
+                        </w:rPr>
+                        <w:t xml:space="preserve"> %}</w:t>
                       </w:r>
                     </w:p>
                     <w:p>
@@ -1401,12 +2456,21 @@
                         </w:rPr>
                         <w:t xml:space="preserve"> </w:t>
                       </w:r>
-                      <w:r>
-                        <w:rPr>
-                          <w:b/>
-                          <w:bCs/>
-                        </w:rPr>
-                        <w:t>endif %}</w:t>
+                      <w:proofErr w:type="spellStart"/>
+                      <w:r>
+                        <w:rPr>
+                          <w:b/>
+                          <w:bCs/>
+                        </w:rPr>
+                        <w:t>endif</w:t>
+                      </w:r>
+                      <w:proofErr w:type="spellEnd"/>
+                      <w:r>
+                        <w:rPr>
+                          <w:b/>
+                          <w:bCs/>
+                        </w:rPr>
+                        <w:t xml:space="preserve"> %}</w:t>
                       </w:r>
                     </w:p>
                     <w:p>
@@ -1424,7 +2488,23 @@
                           <w:b/>
                           <w:bCs/>
                         </w:rPr>
-                        <w:t>{%- endfor %}</w:t>
+                        <w:t xml:space="preserve">{%- </w:t>
+                      </w:r>
+                      <w:proofErr w:type="spellStart"/>
+                      <w:r>
+                        <w:rPr>
+                          <w:b/>
+                          <w:bCs/>
+                        </w:rPr>
+                        <w:t>endfor</w:t>
+                      </w:r>
+                      <w:proofErr w:type="spellEnd"/>
+                      <w:r>
+                        <w:rPr>
+                          <w:b/>
+                          <w:bCs/>
+                        </w:rPr>
+                        <w:t xml:space="preserve"> %}</w:t>
                       </w:r>
                     </w:p>
                     <w:p>
@@ -1469,7 +2549,39 @@
                           <w:b/>
                           <w:bCs/>
                         </w:rPr>
-                        <w:t>{%- if projeto.servicos.tem_engenharia %}</w:t>
+                        <w:t xml:space="preserve">{%- </w:t>
+                      </w:r>
+                      <w:proofErr w:type="spellStart"/>
+                      <w:r>
+                        <w:rPr>
+                          <w:b/>
+                          <w:bCs/>
+                        </w:rPr>
+                        <w:t>if</w:t>
+                      </w:r>
+                      <w:proofErr w:type="spellEnd"/>
+                      <w:r>
+                        <w:rPr>
+                          <w:b/>
+                          <w:bCs/>
+                        </w:rPr>
+                        <w:t xml:space="preserve"> </w:t>
+                      </w:r>
+                      <w:proofErr w:type="spellStart"/>
+                      <w:r>
+                        <w:rPr>
+                          <w:b/>
+                          <w:bCs/>
+                        </w:rPr>
+                        <w:t>projeto.servicos.tem_engenharia</w:t>
+                      </w:r>
+                      <w:proofErr w:type="spellEnd"/>
+                      <w:r>
+                        <w:rPr>
+                          <w:b/>
+                          <w:bCs/>
+                        </w:rPr>
+                        <w:t xml:space="preserve"> %}</w:t>
                       </w:r>
                     </w:p>
                     <w:p>
@@ -1562,7 +2674,48 @@
                           <w:b/>
                           <w:bCs/>
                         </w:rPr>
-                        <w:t>{{projeto.servicos.engenharia.valor_formatado}}</w:t>
+                        <w:t>{{</w:t>
+                      </w:r>
+                      <w:proofErr w:type="spellStart"/>
+                      <w:proofErr w:type="gramStart"/>
+                      <w:r>
+                        <w:rPr>
+                          <w:b/>
+                          <w:bCs/>
+                        </w:rPr>
+                        <w:t>projeto.servicos</w:t>
+                      </w:r>
+                      <w:proofErr w:type="gramEnd"/>
+                      <w:r>
+                        <w:rPr>
+                          <w:b/>
+                          <w:bCs/>
+                        </w:rPr>
+                        <w:t>.</w:t>
+                      </w:r>
+                      <w:proofErr w:type="gramStart"/>
+                      <w:r>
+                        <w:rPr>
+                          <w:b/>
+                          <w:bCs/>
+                        </w:rPr>
+                        <w:t>engenharia.valor</w:t>
+                      </w:r>
+                      <w:proofErr w:type="gramEnd"/>
+                      <w:r>
+                        <w:rPr>
+                          <w:b/>
+                          <w:bCs/>
+                        </w:rPr>
+                        <w:t>_formatado</w:t>
+                      </w:r>
+                      <w:proofErr w:type="spellEnd"/>
+                      <w:r>
+                        <w:rPr>
+                          <w:b/>
+                          <w:bCs/>
+                        </w:rPr>
+                        <w:t>}}</w:t>
                       </w:r>
                     </w:p>
                     <w:p>
@@ -1588,7 +2741,25 @@
                         <w:t xml:space="preserve"> </w:t>
                       </w:r>
                       <w:r>
-                        <w:t>{{projeto.servicos.engenharia.descricao}}</w:t>
+                        <w:t>{{</w:t>
+                      </w:r>
+                      <w:proofErr w:type="spellStart"/>
+                      <w:proofErr w:type="gramStart"/>
+                      <w:r>
+                        <w:t>projeto.servicos</w:t>
+                      </w:r>
+                      <w:proofErr w:type="gramEnd"/>
+                      <w:r>
+                        <w:t>.</w:t>
+                      </w:r>
+                      <w:proofErr w:type="gramStart"/>
+                      <w:r>
+                        <w:t>engenharia.descricao</w:t>
+                      </w:r>
+                      <w:proofErr w:type="spellEnd"/>
+                      <w:proofErr w:type="gramEnd"/>
+                      <w:r>
+                        <w:t>}}</w:t>
                       </w:r>
                     </w:p>
                     <w:p>
@@ -1609,7 +2780,23 @@
                           <w:b/>
                           <w:bCs/>
                         </w:rPr>
-                        <w:t>{%- endif %}</w:t>
+                        <w:t xml:space="preserve">{%- </w:t>
+                      </w:r>
+                      <w:proofErr w:type="spellStart"/>
+                      <w:r>
+                        <w:rPr>
+                          <w:b/>
+                          <w:bCs/>
+                        </w:rPr>
+                        <w:t>endif</w:t>
+                      </w:r>
+                      <w:proofErr w:type="spellEnd"/>
+                      <w:r>
+                        <w:rPr>
+                          <w:b/>
+                          <w:bCs/>
+                        </w:rPr>
+                        <w:t xml:space="preserve"> %}</w:t>
                       </w:r>
                     </w:p>
                     <w:p>
@@ -1630,7 +2817,39 @@
                           <w:b/>
                           <w:bCs/>
                         </w:rPr>
-                        <w:t>{%- if projeto.servicos.tem_adicionais %}</w:t>
+                        <w:t xml:space="preserve">{%- </w:t>
+                      </w:r>
+                      <w:proofErr w:type="spellStart"/>
+                      <w:r>
+                        <w:rPr>
+                          <w:b/>
+                          <w:bCs/>
+                        </w:rPr>
+                        <w:t>if</w:t>
+                      </w:r>
+                      <w:proofErr w:type="spellEnd"/>
+                      <w:r>
+                        <w:rPr>
+                          <w:b/>
+                          <w:bCs/>
+                        </w:rPr>
+                        <w:t xml:space="preserve"> </w:t>
+                      </w:r>
+                      <w:proofErr w:type="spellStart"/>
+                      <w:r>
+                        <w:rPr>
+                          <w:b/>
+                          <w:bCs/>
+                        </w:rPr>
+                        <w:t>projeto.servicos.tem_adicionais</w:t>
+                      </w:r>
+                      <w:proofErr w:type="spellEnd"/>
+                      <w:r>
+                        <w:rPr>
+                          <w:b/>
+                          <w:bCs/>
+                        </w:rPr>
+                        <w:t xml:space="preserve"> %}</w:t>
                       </w:r>
                     </w:p>
                     <w:p>
@@ -1694,7 +2913,32 @@
                           <w:b/>
                           <w:bCs/>
                         </w:rPr>
-                        <w:t>{%- for adicional in projeto.servicos.adicionais %}</w:t>
+                        <w:t xml:space="preserve">{%- for adicional in </w:t>
+                      </w:r>
+                      <w:proofErr w:type="spellStart"/>
+                      <w:proofErr w:type="gramStart"/>
+                      <w:r>
+                        <w:rPr>
+                          <w:b/>
+                          <w:bCs/>
+                        </w:rPr>
+                        <w:t>projeto.servicos</w:t>
+                      </w:r>
+                      <w:proofErr w:type="gramEnd"/>
+                      <w:r>
+                        <w:rPr>
+                          <w:b/>
+                          <w:bCs/>
+                        </w:rPr>
+                        <w:t>.adicionais</w:t>
+                      </w:r>
+                      <w:proofErr w:type="spellEnd"/>
+                      <w:r>
+                        <w:rPr>
+                          <w:b/>
+                          <w:bCs/>
+                        </w:rPr>
+                        <w:t xml:space="preserve"> %}</w:t>
                       </w:r>
                     </w:p>
                     <w:p>
@@ -1744,10 +2988,45 @@
                           <w:b/>
                           <w:bCs/>
                         </w:rPr>
-                        <w:t xml:space="preserve">{{adicional.valor_formatado}} </w:t>
-                      </w:r>
-                      <w:r>
-                        <w:t>- {{adicional.descricao}}</w:t>
+                        <w:t>{{</w:t>
+                      </w:r>
+                      <w:proofErr w:type="spellStart"/>
+                      <w:proofErr w:type="gramStart"/>
+                      <w:r>
+                        <w:rPr>
+                          <w:b/>
+                          <w:bCs/>
+                        </w:rPr>
+                        <w:t>adicional.valor</w:t>
+                      </w:r>
+                      <w:proofErr w:type="gramEnd"/>
+                      <w:r>
+                        <w:rPr>
+                          <w:b/>
+                          <w:bCs/>
+                        </w:rPr>
+                        <w:t>_formatado</w:t>
+                      </w:r>
+                      <w:proofErr w:type="spellEnd"/>
+                      <w:r>
+                        <w:rPr>
+                          <w:b/>
+                          <w:bCs/>
+                        </w:rPr>
+                        <w:t xml:space="preserve">}} </w:t>
+                      </w:r>
+                      <w:r>
+                        <w:t>- {{</w:t>
+                      </w:r>
+                      <w:proofErr w:type="spellStart"/>
+                      <w:proofErr w:type="gramStart"/>
+                      <w:r>
+                        <w:t>adicional.descricao</w:t>
+                      </w:r>
+                      <w:proofErr w:type="spellEnd"/>
+                      <w:proofErr w:type="gramEnd"/>
+                      <w:r>
+                        <w:t>}}</w:t>
                       </w:r>
                     </w:p>
                     <w:p>
@@ -1768,7 +3047,23 @@
                           <w:b/>
                           <w:bCs/>
                         </w:rPr>
-                        <w:t>{%- endfor %}</w:t>
+                        <w:t xml:space="preserve">{%- </w:t>
+                      </w:r>
+                      <w:proofErr w:type="spellStart"/>
+                      <w:r>
+                        <w:rPr>
+                          <w:b/>
+                          <w:bCs/>
+                        </w:rPr>
+                        <w:t>endfor</w:t>
+                      </w:r>
+                      <w:proofErr w:type="spellEnd"/>
+                      <w:r>
+                        <w:rPr>
+                          <w:b/>
+                          <w:bCs/>
+                        </w:rPr>
+                        <w:t xml:space="preserve"> %}</w:t>
                       </w:r>
                     </w:p>
                     <w:p>
@@ -1789,7 +3084,23 @@
                           <w:b/>
                           <w:bCs/>
                         </w:rPr>
-                        <w:t>{%- endif %}</w:t>
+                        <w:t xml:space="preserve">{%- </w:t>
+                      </w:r>
+                      <w:proofErr w:type="spellStart"/>
+                      <w:r>
+                        <w:rPr>
+                          <w:b/>
+                          <w:bCs/>
+                        </w:rPr>
+                        <w:t>endif</w:t>
+                      </w:r>
+                      <w:proofErr w:type="spellEnd"/>
+                      <w:r>
+                        <w:rPr>
+                          <w:b/>
+                          <w:bCs/>
+                        </w:rPr>
+                        <w:t xml:space="preserve"> %}</w:t>
                       </w:r>
                     </w:p>
                     <w:p>
@@ -1839,8 +3150,26 @@
                           <w:b/>
                           <w:bCs/>
                         </w:rPr>
-                        <w:t>TOTAL DO PROJETO: {{projeto.valor_total_projeto_formatado</w:t>
-                      </w:r>
+                        <w:t>TOTAL DO PROJETO: {{</w:t>
+                      </w:r>
+                      <w:proofErr w:type="spellStart"/>
+                      <w:proofErr w:type="gramStart"/>
+                      <w:r>
+                        <w:rPr>
+                          <w:b/>
+                          <w:bCs/>
+                        </w:rPr>
+                        <w:t>projeto.valor</w:t>
+                      </w:r>
+                      <w:proofErr w:type="gramEnd"/>
+                      <w:r>
+                        <w:rPr>
+                          <w:b/>
+                          <w:bCs/>
+                        </w:rPr>
+                        <w:t>_total_projeto_formatado</w:t>
+                      </w:r>
+                      <w:proofErr w:type="spellEnd"/>
                       <w:r>
                         <w:rPr>
                           <w:b/>
@@ -1876,8 +3205,18 @@
                           <w:bCs/>
                           <w:lang w:val="en-US"/>
                         </w:rPr>
-                        <w:t>{%endfor</w:t>
-                      </w:r>
+                        <w:t>{%</w:t>
+                      </w:r>
+                      <w:proofErr w:type="spellStart"/>
+                      <w:r>
+                        <w:rPr>
+                          <w:b/>
+                          <w:bCs/>
+                          <w:lang w:val="en-US"/>
+                        </w:rPr>
+                        <w:t>endfor</w:t>
+                      </w:r>
+                      <w:proofErr w:type="spellEnd"/>
                       <w:r>
                         <w:rPr>
                           <w:b/>
@@ -1916,7 +3255,35 @@
                           <w:bCs/>
                           <w:lang w:val="en-US"/>
                         </w:rPr>
-                        <w:t xml:space="preserve">TOTAL GLOBAL: {{total_global}} </w:t>
+                        <w:t xml:space="preserve">TOTAL </w:t>
+                      </w:r>
+                      <w:proofErr w:type="gramStart"/>
+                      <w:r>
+                        <w:rPr>
+                          <w:b/>
+                          <w:bCs/>
+                          <w:lang w:val="en-US"/>
+                        </w:rPr>
+                        <w:t>GLOBAL: {{</w:t>
+                      </w:r>
+                      <w:proofErr w:type="spellStart"/>
+                      <w:proofErr w:type="gramEnd"/>
+                      <w:r>
+                        <w:rPr>
+                          <w:b/>
+                          <w:bCs/>
+                          <w:lang w:val="en-US"/>
+                        </w:rPr>
+                        <w:t>total_global</w:t>
+                      </w:r>
+                      <w:proofErr w:type="spellEnd"/>
+                      <w:r>
+                        <w:rPr>
+                          <w:b/>
+                          <w:bCs/>
+                          <w:lang w:val="en-US"/>
+                        </w:rPr>
+                        <w:t xml:space="preserve">}} </w:t>
                       </w:r>
                     </w:p>
                     <w:p>
@@ -2504,7 +3871,15 @@
         <w:tab/>
       </w:r>
       <w:r>
-        <w:t>Matheus Pacheco Herzeberg Gonçalves</w:t>
+        <w:t xml:space="preserve">Matheus Pacheco </w:t>
+      </w:r>
+      <w:proofErr w:type="spellStart"/>
+      <w:r>
+        <w:t>Herzeberg</w:t>
+      </w:r>
+      <w:proofErr w:type="spellEnd"/>
+      <w:r>
+        <w:t xml:space="preserve"> Gonçalves</w:t>
       </w:r>
     </w:p>
     <w:p>
@@ -4900,6 +6275,7 @@
     <w:rsid w:val="00283832"/>
     <w:rsid w:val="00295AC2"/>
     <w:rsid w:val="002C360A"/>
+    <w:rsid w:val="002C7367"/>
     <w:rsid w:val="003211A3"/>
     <w:rsid w:val="00324165"/>
     <w:rsid w:val="00325688"/>
@@ -4932,7 +6308,9 @@
     <w:rsid w:val="007B1C84"/>
     <w:rsid w:val="007B5A39"/>
     <w:rsid w:val="007E3134"/>
+    <w:rsid w:val="00804B4C"/>
     <w:rsid w:val="008954A0"/>
+    <w:rsid w:val="008B6EB9"/>
     <w:rsid w:val="008C136F"/>
     <w:rsid w:val="0090330B"/>
     <w:rsid w:val="00936B0A"/>
@@ -4975,6 +6353,7 @@
     <w:rsid w:val="00ED34C6"/>
     <w:rsid w:val="00F56DE5"/>
     <w:rsid w:val="00FB73A3"/>
+    <w:rsid w:val="00FC258A"/>
     <w:rsid w:val="00FD6DD4"/>
   </w:rsids>
   <m:mathPr>

</xml_diff>